<commit_message>
Reorganize domain folders and add meeting documents
- Rename Monetization Domain folder to include full scope description
- Move Product Experience Domain files to Product Exp - dim_editor_session
- Add IT Domain meeting notes and requirements documents
- Add Marketing Domain meeting notes and requirements documents
- Update Print Domain questions document

.... Generated with [Cortex Code](https://docs.snowflake.com/user-guide/snowflake-cortex/cortex-agents)

Co-Authored-By: Cortex Code <noreply@snowflake.com>
</commit_message>
<xml_diff>
--- a/4-DataPipelinePrioritisation/Print Domain/Print Domain-Questions.docx
+++ b/4-DataPipelinePrioritisation/Print Domain/Print Domain-Questions.docx
@@ -24,7 +24,7 @@
         <w:rPr>
           <w:rtl w:val="0"/>
         </w:rPr>
-        <w:t xml:space="preserve">The scope of the project for the product experience domain is to:</w:t>
+        <w:t xml:space="preserve">The scope of the project for the print domain is to:</w:t>
       </w:r>
     </w:p>
     <w:p>
@@ -42,7 +42,7 @@
         <w:rPr>
           <w:rtl w:val="0"/>
         </w:rPr>
-        <w:t xml:space="preserve">Scope of monetization domain is the following data pipelines:</w:t>
+        <w:t xml:space="preserve">Scope of print domain is the following data pipelines:</w:t>
       </w:r>
     </w:p>
     <w:p>
@@ -291,6 +291,57 @@
         <w:rPr>
           <w:rtl w:val="0"/>
         </w:rPr>
+        <w:t xml:space="preserve">source data is not ingested directly into these 2 facts. There is a source layer, and multiple transformations</w:t>
+      </w:r>
+    </w:p>
+    <w:p>
+      <w:pPr>
+        <w:numPr>
+          <w:ilvl w:val="1"/>
+          <w:numId w:val="1"/>
+        </w:numPr>
+        <w:spacing w:after="0" w:afterAutospacing="0" w:before="0" w:beforeAutospacing="0" w:line="335.99999999999994" w:lineRule="auto"/>
+        <w:ind w:left="1440" w:hanging="360"/>
+      </w:pPr>
+      <w:r>
+        <w:rPr>
+          <w:rtl w:val="0"/>
+        </w:rPr>
+        <w:t xml:space="preserve">Currently sourcing from 4 services</w:t>
+      </w:r>
+    </w:p>
+    <w:p>
+      <w:pPr>
+        <w:numPr>
+          <w:ilvl w:val="1"/>
+          <w:numId w:val="1"/>
+        </w:numPr>
+        <w:spacing w:after="0" w:afterAutospacing="0" w:before="0" w:beforeAutospacing="0" w:line="335.99999999999994" w:lineRule="auto"/>
+        <w:ind w:left="1440" w:hanging="360"/>
+        <w:rPr>
+          <w:u w:val="none"/>
+        </w:rPr>
+      </w:pPr>
+      <w:r>
+        <w:rPr>
+          <w:rtl w:val="0"/>
+        </w:rPr>
+        <w:t xml:space="preserve">Using something close to 24 tables before landing eventually in the 2 final tables</w:t>
+      </w:r>
+    </w:p>
+    <w:p>
+      <w:pPr>
+        <w:numPr>
+          <w:ilvl w:val="1"/>
+          <w:numId w:val="1"/>
+        </w:numPr>
+        <w:spacing w:after="0" w:afterAutospacing="0" w:before="0" w:beforeAutospacing="0" w:line="335.99999999999994" w:lineRule="auto"/>
+        <w:ind w:left="1440" w:hanging="360"/>
+      </w:pPr>
+      <w:r>
+        <w:rPr>
+          <w:rtl w:val="0"/>
+        </w:rPr>
         <w:t xml:space="preserve">Fact_print_funnel:</w:t>
       </w:r>
     </w:p>
@@ -307,22 +358,6 @@
         <w:rPr>
           <w:rtl w:val="0"/>
         </w:rPr>
-        <w:t xml:space="preserve">source data is ingested directly into these 2 facts</w:t>
-      </w:r>
-    </w:p>
-    <w:p>
-      <w:pPr>
-        <w:numPr>
-          <w:ilvl w:val="2"/>
-          <w:numId w:val="1"/>
-        </w:numPr>
-        <w:spacing w:after="0" w:afterAutospacing="0" w:before="0" w:beforeAutospacing="0" w:line="335.99999999999994" w:lineRule="auto"/>
-        <w:ind w:left="2160" w:hanging="360"/>
-      </w:pPr>
-      <w:r>
-        <w:rPr>
-          <w:rtl w:val="0"/>
-        </w:rPr>
         <w:t xml:space="preserve">Facts contain many “events”</w:t>
       </w:r>
     </w:p>
@@ -1434,25 +1469,45 @@
         <w:rPr>
           <w:rtl w:val="0"/>
         </w:rPr>
-        <w:t xml:space="preserve">Concern about performance in new data model</w:t>
-      </w:r>
-    </w:p>
-    <w:p>
-      <w:pPr>
-        <w:numPr>
-          <w:ilvl w:val="1"/>
-          <w:numId w:val="1"/>
-        </w:numPr>
-        <w:spacing w:after="0" w:afterAutospacing="0" w:before="0" w:beforeAutospacing="0" w:line="335.99999999999994" w:lineRule="auto"/>
-        <w:ind w:left="1440" w:hanging="360"/>
-        <w:rPr>
-          <w:u w:val="none"/>
-        </w:rPr>
-      </w:pPr>
-      <w:r>
-        <w:rPr>
-          <w:rtl w:val="0"/>
-        </w:rPr>
+        <w:t xml:space="preserve">None of this has been built yet</w:t>
+      </w:r>
+    </w:p>
+    <w:p>
+      <w:pPr>
+        <w:numPr>
+          <w:ilvl w:val="2"/>
+          <w:numId w:val="1"/>
+        </w:numPr>
+        <w:spacing w:after="0" w:afterAutospacing="0" w:before="0" w:beforeAutospacing="0" w:line="335.99999999999994" w:lineRule="auto"/>
+        <w:ind w:left="2160" w:hanging="360"/>
+        <w:rPr>
+          <w:u w:val="none"/>
+        </w:rPr>
+      </w:pPr>
+      <w:r>
+        <w:rPr>
+          <w:rtl w:val="0"/>
+        </w:rPr>
+        <w:t xml:space="preserve">Concerns about performance in new data model in the semantic views</w:t>
+      </w:r>
+    </w:p>
+    <w:p>
+      <w:pPr>
+        <w:numPr>
+          <w:ilvl w:val="2"/>
+          <w:numId w:val="1"/>
+        </w:numPr>
+        <w:spacing w:after="0" w:afterAutospacing="0" w:before="0" w:beforeAutospacing="0" w:line="335.99999999999994" w:lineRule="auto"/>
+        <w:ind w:left="2160" w:hanging="360"/>
+        <w:rPr>
+          <w:u w:val="none"/>
+        </w:rPr>
+      </w:pPr>
+      <w:r>
+        <w:rPr>
+          <w:rtl w:val="0"/>
+        </w:rPr>
+        <w:t xml:space="preserve">Concerns are due to granularity issues between the different tables</w:t>
       </w:r>
     </w:p>
     <w:p>
@@ -1507,6 +1562,60 @@
     <w:p>
       <w:pPr>
         <w:numPr>
+          <w:ilvl w:val="2"/>
+          <w:numId w:val="1"/>
+        </w:numPr>
+        <w:ind w:left="2160" w:hanging="360"/>
+        <w:rPr>
+          <w:u w:val="none"/>
+        </w:rPr>
+      </w:pPr>
+      <w:r>
+        <w:rPr>
+          <w:rtl w:val="0"/>
+        </w:rPr>
+        <w:t xml:space="preserve">Fact_print_ordered: less than 10 models</w:t>
+      </w:r>
+    </w:p>
+    <w:p>
+      <w:pPr>
+        <w:numPr>
+          <w:ilvl w:val="2"/>
+          <w:numId w:val="1"/>
+        </w:numPr>
+        <w:ind w:left="2160" w:hanging="360"/>
+        <w:rPr>
+          <w:u w:val="none"/>
+        </w:rPr>
+      </w:pPr>
+      <w:r>
+        <w:rPr>
+          <w:rtl w:val="0"/>
+        </w:rPr>
+        <w:t xml:space="preserve">Fact_print_funnel: around 20 models</w:t>
+      </w:r>
+    </w:p>
+    <w:p>
+      <w:pPr>
+        <w:numPr>
+          <w:ilvl w:val="2"/>
+          <w:numId w:val="1"/>
+        </w:numPr>
+        <w:ind w:left="2160" w:hanging="360"/>
+        <w:rPr>
+          <w:u w:val="none"/>
+        </w:rPr>
+      </w:pPr>
+      <w:r>
+        <w:rPr>
+          <w:rtl w:val="0"/>
+        </w:rPr>
+        <w:t xml:space="preserve">He feels a lot of these models aren’t necessarily all needed. They are not efficient</w:t>
+      </w:r>
+    </w:p>
+    <w:p>
+      <w:pPr>
+        <w:numPr>
           <w:ilvl w:val="1"/>
           <w:numId w:val="1"/>
         </w:numPr>
@@ -1537,43 +1646,25 @@
         <w:rPr>
           <w:rtl w:val="0"/>
         </w:rPr>
-        <w:t xml:space="preserve">Redesign all estimated 50 DBT models into the new namespace. </w:t>
-      </w:r>
-    </w:p>
-    <w:p>
-      <w:pPr>
-        <w:numPr>
-          <w:ilvl w:val="2"/>
-          <w:numId w:val="1"/>
-        </w:numPr>
-        <w:ind w:left="2160" w:hanging="360"/>
-        <w:rPr>
-          <w:u w:val="none"/>
-        </w:rPr>
-      </w:pPr>
-      <w:r>
-        <w:rPr>
-          <w:rtl w:val="0"/>
-        </w:rPr>
-        <w:t xml:space="preserve">Assume all dependent objects are available by reading their outcome from their current location, or</w:t>
-      </w:r>
-    </w:p>
-    <w:p>
-      <w:pPr>
-        <w:numPr>
-          <w:ilvl w:val="2"/>
-          <w:numId w:val="1"/>
-        </w:numPr>
-        <w:ind w:left="2160" w:hanging="360"/>
-        <w:rPr>
-          <w:u w:val="none"/>
-        </w:rPr>
-      </w:pPr>
-      <w:r>
-        <w:rPr>
-          <w:rtl w:val="0"/>
-        </w:rPr>
-        <w:t xml:space="preserve">Migrate dependencies as well</w:t>
+        <w:t xml:space="preserve">Redesign all estimated ~ 30 DBT models into the new namespace. </w:t>
+      </w:r>
+    </w:p>
+    <w:p>
+      <w:pPr>
+        <w:numPr>
+          <w:ilvl w:val="2"/>
+          <w:numId w:val="1"/>
+        </w:numPr>
+        <w:ind w:left="2160" w:hanging="360"/>
+        <w:rPr>
+          <w:u w:val="none"/>
+        </w:rPr>
+      </w:pPr>
+      <w:r>
+        <w:rPr>
+          <w:rtl w:val="0"/>
+        </w:rPr>
+        <w:t xml:space="preserve">Assume all dependent objects are available by reading their outcome from their current location</w:t>
       </w:r>
     </w:p>
     <w:p>
@@ -1621,24 +1712,97 @@
         <w:rPr>
           <w:rtl w:val="0"/>
         </w:rPr>
-        <w:t xml:space="preserve">No clear requirement</w:t>
-      </w:r>
-    </w:p>
-    <w:p>
-      <w:pPr>
-        <w:numPr>
-          <w:ilvl w:val="1"/>
-          <w:numId w:val="1"/>
-        </w:numPr>
-        <w:ind w:left="1440" w:hanging="360"/>
-        <w:rPr>
-          <w:color w:val="6aa84f"/>
-        </w:rPr>
-      </w:pPr>
-      <w:r>
-        <w:rPr>
-          <w:rtl w:val="0"/>
-        </w:rPr>
+        <w:t xml:space="preserve">Currently, daily offline process based on a schedule</w:t>
+      </w:r>
+    </w:p>
+    <w:p>
+      <w:pPr>
+        <w:numPr>
+          <w:ilvl w:val="1"/>
+          <w:numId w:val="1"/>
+        </w:numPr>
+        <w:ind w:left="1440" w:hanging="360"/>
+        <w:rPr>
+          <w:u w:val="none"/>
+        </w:rPr>
+      </w:pPr>
+      <w:r>
+        <w:rPr>
+          <w:rtl w:val="0"/>
+        </w:rPr>
+        <w:t xml:space="preserve">No need for event based</w:t>
+      </w:r>
+    </w:p>
+    <w:p>
+      <w:pPr>
+        <w:numPr>
+          <w:ilvl w:val="1"/>
+          <w:numId w:val="1"/>
+        </w:numPr>
+        <w:ind w:left="1440" w:hanging="360"/>
+        <w:rPr>
+          <w:u w:val="none"/>
+        </w:rPr>
+      </w:pPr>
+      <w:r>
+        <w:rPr>
+          <w:rtl w:val="0"/>
+        </w:rPr>
+        <w:t xml:space="preserve">Currently using cron jobs</w:t>
+      </w:r>
+    </w:p>
+    <w:p>
+      <w:pPr>
+        <w:numPr>
+          <w:ilvl w:val="1"/>
+          <w:numId w:val="1"/>
+        </w:numPr>
+        <w:ind w:left="1440" w:hanging="360"/>
+        <w:rPr>
+          <w:u w:val="none"/>
+        </w:rPr>
+      </w:pPr>
+      <w:r>
+        <w:rPr>
+          <w:rtl w:val="0"/>
+        </w:rPr>
+        <w:t xml:space="preserve">Fact_print_ordered (currently offline process) should be changed to be event driven based on upstream tables that are refreshed every 2 hours</w:t>
+      </w:r>
+    </w:p>
+    <w:p>
+      <w:pPr>
+        <w:numPr>
+          <w:ilvl w:val="1"/>
+          <w:numId w:val="1"/>
+        </w:numPr>
+        <w:ind w:left="1440" w:hanging="360"/>
+        <w:rPr>
+          <w:u w:val="none"/>
+        </w:rPr>
+      </w:pPr>
+      <w:r>
+        <w:rPr>
+          <w:rtl w:val="0"/>
+        </w:rPr>
+        <w:t xml:space="preserve">Fact_print_funnel is going to remain as an offline daily process</w:t>
+      </w:r>
+    </w:p>
+    <w:p>
+      <w:pPr>
+        <w:numPr>
+          <w:ilvl w:val="1"/>
+          <w:numId w:val="1"/>
+        </w:numPr>
+        <w:ind w:left="1440" w:hanging="360"/>
+        <w:rPr>
+          <w:u w:val="none"/>
+        </w:rPr>
+      </w:pPr>
+      <w:r>
+        <w:rPr>
+          <w:rtl w:val="0"/>
+        </w:rPr>
+        <w:t xml:space="preserve">Target state should be in airflow</w:t>
       </w:r>
     </w:p>
     <w:p>
@@ -1671,7 +1835,91 @@
         <w:rPr>
           <w:rtl w:val="0"/>
         </w:rPr>
-        <w:t xml:space="preserve">No clear requirement</w:t>
+        <w:t xml:space="preserve">Fact_print_ordered:</w:t>
+      </w:r>
+    </w:p>
+    <w:p>
+      <w:pPr>
+        <w:numPr>
+          <w:ilvl w:val="2"/>
+          <w:numId w:val="1"/>
+        </w:numPr>
+        <w:ind w:left="2160" w:hanging="360"/>
+      </w:pPr>
+      <w:r>
+        <w:rPr>
+          <w:rtl w:val="0"/>
+        </w:rPr>
+        <w:t xml:space="preserve">no need to since data volume is small so we can rebuild</w:t>
+      </w:r>
+    </w:p>
+    <w:p>
+      <w:pPr>
+        <w:numPr>
+          <w:ilvl w:val="2"/>
+          <w:numId w:val="1"/>
+        </w:numPr>
+        <w:ind w:left="2160" w:hanging="360"/>
+      </w:pPr>
+      <w:r>
+        <w:rPr>
+          <w:rtl w:val="0"/>
+        </w:rPr>
+        <w:t xml:space="preserve">Current size: 30m rows, but not migrating it</w:t>
+      </w:r>
+    </w:p>
+    <w:p>
+      <w:pPr>
+        <w:numPr>
+          <w:ilvl w:val="1"/>
+          <w:numId w:val="1"/>
+        </w:numPr>
+        <w:ind w:left="1440" w:hanging="360"/>
+        <w:rPr>
+          <w:u w:val="none"/>
+        </w:rPr>
+      </w:pPr>
+      <w:r>
+        <w:rPr>
+          <w:rtl w:val="0"/>
+        </w:rPr>
+        <w:t xml:space="preserve">Fact_print_funnel: </w:t>
+      </w:r>
+    </w:p>
+    <w:p>
+      <w:pPr>
+        <w:numPr>
+          <w:ilvl w:val="2"/>
+          <w:numId w:val="1"/>
+        </w:numPr>
+        <w:ind w:left="2160" w:hanging="360"/>
+        <w:rPr>
+          <w:u w:val="none"/>
+        </w:rPr>
+      </w:pPr>
+      <w:r>
+        <w:rPr>
+          <w:rtl w:val="0"/>
+        </w:rPr>
+        <w:t xml:space="preserve">We need to migrate data</w:t>
+      </w:r>
+    </w:p>
+    <w:p>
+      <w:pPr>
+        <w:numPr>
+          <w:ilvl w:val="2"/>
+          <w:numId w:val="1"/>
+        </w:numPr>
+        <w:ind w:left="2160" w:hanging="360"/>
+        <w:rPr>
+          <w:u w:val="none"/>
+        </w:rPr>
+      </w:pPr>
+      <w:r>
+        <w:rPr>
+          <w:rtl w:val="0"/>
+        </w:rPr>
+        <w:t xml:space="preserve">Current size: 7.5b rows, 2.5 TB since it is all events</w:t>
       </w:r>
     </w:p>
     <w:p>
@@ -1707,43 +1955,25 @@
         <w:rPr>
           <w:rtl w:val="0"/>
         </w:rPr>
-        <w:t xml:space="preserve">Set up the relevant data classifications on the new objects in the new layers</w:t>
-      </w:r>
-    </w:p>
-    <w:p>
-      <w:pPr>
-        <w:numPr>
-          <w:ilvl w:val="1"/>
-          <w:numId w:val="1"/>
-        </w:numPr>
-        <w:ind w:left="1440" w:hanging="360"/>
-        <w:rPr>
-          <w:u w:val="none"/>
-        </w:rPr>
-      </w:pPr>
-      <w:r>
-        <w:rPr>
-          <w:rtl w:val="0"/>
-        </w:rPr>
-        <w:t xml:space="preserve">Set up the relevant data masking policies and row access policies on the new objects in the new layers.</w:t>
-      </w:r>
-    </w:p>
-    <w:p>
-      <w:pPr>
-        <w:numPr>
-          <w:ilvl w:val="1"/>
-          <w:numId w:val="1"/>
-        </w:numPr>
-        <w:ind w:left="1440" w:hanging="360"/>
-        <w:rPr>
-          <w:u w:val="none"/>
-        </w:rPr>
-      </w:pPr>
-      <w:r>
-        <w:rPr>
-          <w:rtl w:val="0"/>
-        </w:rPr>
-        <w:t xml:space="preserve">Set up the relevant RBAC policies on the new objects in the new layers</w:t>
+        <w:t xml:space="preserve">No policies or classifications to be migrated</w:t>
+      </w:r>
+    </w:p>
+    <w:p>
+      <w:pPr>
+        <w:numPr>
+          <w:ilvl w:val="1"/>
+          <w:numId w:val="1"/>
+        </w:numPr>
+        <w:ind w:left="1440" w:hanging="360"/>
+        <w:rPr>
+          <w:u w:val="none"/>
+        </w:rPr>
+      </w:pPr>
+      <w:r>
+        <w:rPr>
+          <w:rtl w:val="0"/>
+        </w:rPr>
+        <w:t xml:space="preserve">No RBAC special treatment, whatever had access should maintain access</w:t>
       </w:r>
     </w:p>
     <w:p>
@@ -1872,36 +2102,140 @@
         <w:rPr>
           <w:rtl w:val="0"/>
         </w:rPr>
+        <w:t xml:space="preserve">How final is the target data model of the known fact tables you’ve mentioned?</w:t>
+      </w:r>
+    </w:p>
+    <w:p>
+      <w:pPr>
+        <w:numPr>
+          <w:ilvl w:val="2"/>
+          <w:numId w:val="2"/>
+        </w:numPr>
+        <w:ind w:left="2160" w:hanging="360"/>
+        <w:rPr>
+          <w:u w:val="none"/>
+        </w:rPr>
+      </w:pPr>
+      <w:r>
+        <w:rPr>
+          <w:rtl w:val="0"/>
+        </w:rPr>
+        <w:t xml:space="preserve">Not final</w:t>
+      </w:r>
+    </w:p>
+    <w:p>
+      <w:pPr>
+        <w:numPr>
+          <w:ilvl w:val="2"/>
+          <w:numId w:val="2"/>
+        </w:numPr>
+        <w:ind w:left="2160" w:hanging="360"/>
+        <w:rPr>
+          <w:u w:val="none"/>
+        </w:rPr>
+      </w:pPr>
+      <w:r>
+        <w:rPr>
+          <w:rtl w:val="0"/>
+        </w:rPr>
+        <w:t xml:space="preserve">Should be revisited as part of this projmect</w:t>
+      </w:r>
+    </w:p>
+    <w:p>
+      <w:pPr>
+        <w:numPr>
+          <w:ilvl w:val="1"/>
+          <w:numId w:val="2"/>
+        </w:numPr>
+        <w:ind w:left="1440" w:hanging="360"/>
+      </w:pPr>
+      <w:r>
+        <w:rPr>
+          <w:rtl w:val="0"/>
+        </w:rPr>
         <w:t xml:space="preserve">Source data for the dbt models is all available in SF, right? I.e. there’s no need to ingest new data into the platform.</w:t>
       </w:r>
-      <w:r>
-        <w:rPr>
-          <w:rtl w:val="0"/>
-        </w:rPr>
-      </w:r>
-    </w:p>
-    <w:p>
-      <w:pPr>
-        <w:numPr>
-          <w:ilvl w:val="1"/>
-          <w:numId w:val="2"/>
-        </w:numPr>
-        <w:ind w:left="1440" w:hanging="360"/>
-      </w:pPr>
-      <w:r>
-        <w:rPr>
-          <w:rtl w:val="0"/>
-        </w:rPr>
-        <w:t xml:space="preserve">How many upstream dependencies exist for each of the 4 report pipelines? Are they all within the print domain or cross-domain?</w:t>
-      </w:r>
-    </w:p>
-    <w:p>
-      <w:pPr>
-        <w:numPr>
-          <w:ilvl w:val="1"/>
-          <w:numId w:val="2"/>
-        </w:numPr>
-        <w:spacing w:after="0" w:afterAutospacing="0"/>
+    </w:p>
+    <w:p>
+      <w:pPr>
+        <w:numPr>
+          <w:ilvl w:val="2"/>
+          <w:numId w:val="2"/>
+        </w:numPr>
+        <w:ind w:left="2160" w:hanging="360"/>
+        <w:rPr>
+          <w:u w:val="none"/>
+        </w:rPr>
+      </w:pPr>
+      <w:r>
+        <w:rPr>
+          <w:rtl w:val="0"/>
+        </w:rPr>
+        <w:t xml:space="preserve">yes</w:t>
+      </w:r>
+      <w:r>
+        <w:rPr>
+          <w:rtl w:val="0"/>
+        </w:rPr>
+      </w:r>
+    </w:p>
+    <w:p>
+      <w:pPr>
+        <w:numPr>
+          <w:ilvl w:val="1"/>
+          <w:numId w:val="2"/>
+        </w:numPr>
+        <w:ind w:left="1440" w:hanging="360"/>
+      </w:pPr>
+      <w:r>
+        <w:rPr>
+          <w:rtl w:val="0"/>
+        </w:rPr>
+        <w:t xml:space="preserve">How many upstream dependencies exist for your pipelines? Are they all within the print domain or cross-domain?</w:t>
+      </w:r>
+    </w:p>
+    <w:p>
+      <w:pPr>
+        <w:numPr>
+          <w:ilvl w:val="2"/>
+          <w:numId w:val="2"/>
+        </w:numPr>
+        <w:ind w:left="2160" w:hanging="360"/>
+        <w:rPr>
+          <w:u w:val="none"/>
+        </w:rPr>
+      </w:pPr>
+      <w:r>
+        <w:rPr>
+          <w:rtl w:val="0"/>
+        </w:rPr>
+        <w:t xml:space="preserve">Mostly from different print services</w:t>
+      </w:r>
+    </w:p>
+    <w:p>
+      <w:pPr>
+        <w:numPr>
+          <w:ilvl w:val="2"/>
+          <w:numId w:val="2"/>
+        </w:numPr>
+        <w:ind w:left="2160" w:hanging="360"/>
+        <w:rPr>
+          <w:u w:val="none"/>
+        </w:rPr>
+      </w:pPr>
+      <w:r>
+        <w:rPr>
+          <w:rtl w:val="0"/>
+        </w:rPr>
+        <w:t xml:space="preserve">Some from foundations</w:t>
+      </w:r>
+    </w:p>
+    <w:p>
+      <w:pPr>
+        <w:numPr>
+          <w:ilvl w:val="1"/>
+          <w:numId w:val="2"/>
+        </w:numPr>
         <w:ind w:left="1440" w:hanging="360"/>
         <w:rPr/>
       </w:pPr>
@@ -1915,10 +2249,27 @@
     <w:p>
       <w:pPr>
         <w:numPr>
-          <w:ilvl w:val="1"/>
-          <w:numId w:val="2"/>
-        </w:numPr>
-        <w:spacing w:after="0" w:afterAutospacing="0" w:before="0" w:beforeAutospacing="0" w:line="335.99999999999994" w:lineRule="auto"/>
+          <w:ilvl w:val="2"/>
+          <w:numId w:val="2"/>
+        </w:numPr>
+        <w:ind w:left="2160" w:hanging="360"/>
+        <w:rPr>
+          <w:u w:val="none"/>
+        </w:rPr>
+      </w:pPr>
+      <w:r>
+        <w:rPr>
+          <w:rtl w:val="0"/>
+        </w:rPr>
+        <w:t xml:space="preserve">yes</w:t>
+      </w:r>
+    </w:p>
+    <w:p>
+      <w:pPr>
+        <w:numPr>
+          <w:ilvl w:val="1"/>
+          <w:numId w:val="2"/>
+        </w:numPr>
         <w:ind w:left="1440" w:hanging="360"/>
         <w:rPr/>
       </w:pPr>
@@ -1926,7 +2277,25 @@
         <w:rPr>
           <w:rtl w:val="0"/>
         </w:rPr>
-        <w:t xml:space="preserve">Are all sources ingested into SF and are expected to still be available as is in the future state?</w:t>
+        <w:t xml:space="preserve">Is it going to be an event trigger or periodic?</w:t>
+      </w:r>
+    </w:p>
+    <w:p>
+      <w:pPr>
+        <w:numPr>
+          <w:ilvl w:val="2"/>
+          <w:numId w:val="2"/>
+        </w:numPr>
+        <w:ind w:left="2160" w:hanging="360"/>
+        <w:rPr>
+          <w:u w:val="none"/>
+        </w:rPr>
+      </w:pPr>
+      <w:r>
+        <w:rPr>
+          <w:rtl w:val="0"/>
+        </w:rPr>
+        <w:t xml:space="preserve">Answered above</w:t>
       </w:r>
     </w:p>
     <w:p>
@@ -1942,7 +2311,25 @@
         <w:rPr>
           <w:rtl w:val="0"/>
         </w:rPr>
-        <w:t xml:space="preserve">Is it going to be an event trigger or periodic?</w:t>
+        <w:t xml:space="preserve">Are we intending to migrate old table data to new data model?</w:t>
+      </w:r>
+    </w:p>
+    <w:p>
+      <w:pPr>
+        <w:numPr>
+          <w:ilvl w:val="2"/>
+          <w:numId w:val="2"/>
+        </w:numPr>
+        <w:ind w:left="2160" w:hanging="360"/>
+        <w:rPr>
+          <w:u w:val="none"/>
+        </w:rPr>
+      </w:pPr>
+      <w:r>
+        <w:rPr>
+          <w:rtl w:val="0"/>
+        </w:rPr>
+        <w:t xml:space="preserve">Answered above</w:t>
       </w:r>
     </w:p>
     <w:p>
@@ -1958,7 +2345,22 @@
         <w:rPr>
           <w:rtl w:val="0"/>
         </w:rPr>
-        <w:t xml:space="preserve">Are we intending to migrate old table data to new data model?</w:t>
+        <w:t xml:space="preserve">What is the current data volume (row counts, storage size) for each key table?</w:t>
+      </w:r>
+    </w:p>
+    <w:p>
+      <w:pPr>
+        <w:numPr>
+          <w:ilvl w:val="2"/>
+          <w:numId w:val="2"/>
+        </w:numPr>
+        <w:ind w:left="2160" w:hanging="360"/>
+      </w:pPr>
+      <w:r>
+        <w:rPr>
+          <w:rtl w:val="0"/>
+        </w:rPr>
+        <w:t xml:space="preserve">Answered above</w:t>
       </w:r>
     </w:p>
     <w:p>
@@ -1974,79 +2376,397 @@
         <w:rPr>
           <w:rtl w:val="0"/>
         </w:rPr>
-        <w:t xml:space="preserve">What is the current data volume (row counts, storage size) for each key table?</w:t>
-      </w:r>
-    </w:p>
-    <w:p>
-      <w:pPr>
-        <w:numPr>
-          <w:ilvl w:val="1"/>
-          <w:numId w:val="2"/>
-        </w:numPr>
-        <w:ind w:left="1440" w:hanging="360"/>
+        <w:t xml:space="preserve">Are there any governance policies to be implemented?</w:t>
+      </w:r>
+    </w:p>
+    <w:p>
+      <w:pPr>
+        <w:numPr>
+          <w:ilvl w:val="2"/>
+          <w:numId w:val="2"/>
+        </w:numPr>
+        <w:ind w:left="2160" w:hanging="360"/>
+      </w:pPr>
+      <w:r>
+        <w:rPr>
+          <w:rtl w:val="0"/>
+        </w:rPr>
+        <w:t xml:space="preserve">Answered above</w:t>
+      </w:r>
+    </w:p>
+    <w:p>
+      <w:pPr>
+        <w:numPr>
+          <w:ilvl w:val="1"/>
+          <w:numId w:val="2"/>
+        </w:numPr>
+        <w:ind w:left="1440" w:hanging="360"/>
+      </w:pPr>
+      <w:r>
+        <w:rPr>
+          <w:rtl w:val="0"/>
+        </w:rPr>
+        <w:t xml:space="preserve">Are there existing metric definitions documented, or do they need to be created from scratch for the semantic layer?</w:t>
+      </w:r>
+    </w:p>
+    <w:p>
+      <w:pPr>
+        <w:numPr>
+          <w:ilvl w:val="2"/>
+          <w:numId w:val="2"/>
+        </w:numPr>
+        <w:ind w:left="2160" w:hanging="360"/>
+        <w:rPr>
+          <w:u w:val="none"/>
+        </w:rPr>
+      </w:pPr>
+      <w:r>
+        <w:rPr>
+          <w:rtl w:val="0"/>
+        </w:rPr>
+        <w:t xml:space="preserve">Not yet</w:t>
+      </w:r>
+    </w:p>
+    <w:p>
+      <w:pPr>
+        <w:numPr>
+          <w:ilvl w:val="2"/>
+          <w:numId w:val="2"/>
+        </w:numPr>
+        <w:ind w:left="2160" w:hanging="360"/>
+        <w:rPr>
+          <w:u w:val="none"/>
+        </w:rPr>
+      </w:pPr>
+      <w:r>
+        <w:rPr>
+          <w:rtl w:val="0"/>
+        </w:rPr>
+        <w:t xml:space="preserve">TBC by end of the week</w:t>
+      </w:r>
+    </w:p>
+    <w:p>
+      <w:pPr>
+        <w:numPr>
+          <w:ilvl w:val="2"/>
+          <w:numId w:val="2"/>
+        </w:numPr>
+        <w:ind w:left="2160" w:hanging="360"/>
+        <w:rPr>
+          <w:u w:val="none"/>
+        </w:rPr>
+      </w:pPr>
+      <w:r>
+        <w:rPr>
+          <w:rtl w:val="0"/>
+        </w:rPr>
+        <w:t xml:space="preserve">He will send me a few examples of metrics</w:t>
+      </w:r>
+    </w:p>
+    <w:p>
+      <w:pPr>
+        <w:numPr>
+          <w:ilvl w:val="2"/>
+          <w:numId w:val="2"/>
+        </w:numPr>
+        <w:ind w:left="2160" w:hanging="360"/>
+        <w:rPr>
+          <w:u w:val="none"/>
+        </w:rPr>
+      </w:pPr>
+      <w:r>
+        <w:rPr>
+          <w:rtl w:val="0"/>
+        </w:rPr>
+        <w:t xml:space="preserve">We can make assumptions accordingly</w:t>
+      </w:r>
+      <w:r>
+        <w:rPr>
+          <w:rtl w:val="0"/>
+        </w:rPr>
+      </w:r>
+    </w:p>
+    <w:p>
+      <w:pPr>
+        <w:numPr>
+          <w:ilvl w:val="1"/>
+          <w:numId w:val="2"/>
+        </w:numPr>
+        <w:ind w:left="1440" w:hanging="360"/>
+        <w:rPr>
+          <w:u w:val="none"/>
+        </w:rPr>
+      </w:pPr>
+      <w:r>
+        <w:rPr>
+          <w:rtl w:val="0"/>
+        </w:rPr>
+        <w:t xml:space="preserve">Do we have a clear view of what needs to be made available in the semantic layer?</w:t>
+      </w:r>
+    </w:p>
+    <w:p>
+      <w:pPr>
+        <w:numPr>
+          <w:ilvl w:val="2"/>
+          <w:numId w:val="2"/>
+        </w:numPr>
+        <w:ind w:left="2160" w:hanging="360"/>
+      </w:pPr>
+      <w:r>
+        <w:rPr>
+          <w:rtl w:val="0"/>
+        </w:rPr>
+        <w:t xml:space="preserve">Answered above</w:t>
+      </w:r>
+    </w:p>
+    <w:p>
+      <w:pPr>
+        <w:numPr>
+          <w:ilvl w:val="1"/>
+          <w:numId w:val="2"/>
+        </w:numPr>
+        <w:ind w:left="1440" w:hanging="360"/>
+        <w:rPr>
+          <w:u w:val="none"/>
+        </w:rPr>
+      </w:pPr>
+      <w:r>
+        <w:rPr>
+          <w:rtl w:val="0"/>
+        </w:rPr>
+        <w:t xml:space="preserve">Fact_print_funnel specific:</w:t>
+      </w:r>
+    </w:p>
+    <w:p>
+      <w:pPr>
+        <w:numPr>
+          <w:ilvl w:val="2"/>
+          <w:numId w:val="2"/>
+        </w:numPr>
+        <w:ind w:left="2160" w:hanging="360"/>
+        <w:rPr>
+          <w:u w:val="none"/>
+        </w:rPr>
+      </w:pPr>
+      <w:r>
+        <w:rPr>
+          <w:rtl w:val="0"/>
+        </w:rPr>
+        <w:t xml:space="preserve">Requirement mentions that there is a “Challenge of Evolving Metrics”. Can you provide an example of the expected changes?</w:t>
+      </w:r>
+    </w:p>
+    <w:p>
+      <w:pPr>
+        <w:numPr>
+          <w:ilvl w:val="3"/>
+          <w:numId w:val="2"/>
+        </w:numPr>
+        <w:ind w:left="2880" w:hanging="360"/>
+        <w:rPr>
+          <w:u w:val="none"/>
+        </w:rPr>
+      </w:pPr>
+      <w:r>
+        <w:rPr>
+          <w:rtl w:val="0"/>
+        </w:rPr>
+        <w:t xml:space="preserve">E.g. is it that the events that are coming through from the source tables that are going to change? Or is it the computations / measures to be computed that are going to change?</w:t>
+      </w:r>
+    </w:p>
+    <w:p>
+      <w:pPr>
+        <w:numPr>
+          <w:ilvl w:val="4"/>
+          <w:numId w:val="2"/>
+        </w:numPr>
+        <w:ind w:left="3600" w:hanging="360"/>
+        <w:rPr>
+          <w:u w:val="none"/>
+        </w:rPr>
+      </w:pPr>
+      <w:r>
+        <w:rPr>
+          <w:rtl w:val="0"/>
+        </w:rPr>
+        <w:t xml:space="preserve">Measures are going to change</w:t>
+      </w:r>
+    </w:p>
+    <w:p>
+      <w:pPr>
+        <w:numPr>
+          <w:ilvl w:val="4"/>
+          <w:numId w:val="2"/>
+        </w:numPr>
+        <w:ind w:left="3600" w:hanging="360"/>
+        <w:rPr>
+          <w:u w:val="none"/>
+        </w:rPr>
+      </w:pPr>
+      <w:r>
+        <w:rPr>
+          <w:rtl w:val="0"/>
+        </w:rPr>
+        <w:t xml:space="preserve">Conformed layer should remain the same, but the way they will be aggregated is what might change</w:t>
+      </w:r>
+    </w:p>
+    <w:p>
+      <w:pPr>
+        <w:numPr>
+          <w:ilvl w:val="4"/>
+          <w:numId w:val="2"/>
+        </w:numPr>
+        <w:ind w:left="3600" w:hanging="360"/>
+        <w:rPr>
+          <w:u w:val="none"/>
+        </w:rPr>
+      </w:pPr>
+      <w:r>
+        <w:rPr>
+          <w:rtl w:val="0"/>
+        </w:rPr>
+        <w:t xml:space="preserve">Measures will be in the metrics layer (dimensional model)</w:t>
+      </w:r>
+    </w:p>
+    <w:p>
+      <w:pPr>
+        <w:numPr>
+          <w:ilvl w:val="3"/>
+          <w:numId w:val="2"/>
+        </w:numPr>
+        <w:ind w:left="2880" w:hanging="360"/>
+        <w:rPr>
+          <w:u w:val="none"/>
+        </w:rPr>
+      </w:pPr>
+      <w:r>
+        <w:rPr>
+          <w:rtl w:val="0"/>
+        </w:rPr>
+        <w:t xml:space="preserve">He does not want a dynamic framework building</w:t>
+      </w:r>
+    </w:p>
+    <w:p>
+      <w:pPr>
+        <w:numPr>
+          <w:ilvl w:val="2"/>
+          <w:numId w:val="2"/>
+        </w:numPr>
+        <w:ind w:left="2160" w:hanging="360"/>
+        <w:rPr>
+          <w:u w:val="none"/>
+        </w:rPr>
+      </w:pPr>
+      <w:r>
+        <w:rPr>
+          <w:rtl w:val="0"/>
+        </w:rPr>
+        <w:t xml:space="preserve">Are all 50+ events map to individual phases?</w:t>
+      </w:r>
+    </w:p>
+    <w:p>
+      <w:pPr>
+        <w:numPr>
+          <w:ilvl w:val="3"/>
+          <w:numId w:val="2"/>
+        </w:numPr>
+        <w:ind w:left="2880" w:hanging="360"/>
+        <w:rPr>
+          <w:u w:val="none"/>
+        </w:rPr>
+      </w:pPr>
+      <w:r>
+        <w:rPr>
+          <w:rtl w:val="0"/>
+        </w:rPr>
+        <w:t xml:space="preserve">Some of the events are within one phase (e.g. edit, edited, deleted)</w:t>
+      </w:r>
+    </w:p>
+    <w:p>
+      <w:pPr>
+        <w:numPr>
+          <w:ilvl w:val="3"/>
+          <w:numId w:val="2"/>
+        </w:numPr>
+        <w:ind w:left="2880" w:hanging="360"/>
+        <w:rPr>
+          <w:u w:val="none"/>
+        </w:rPr>
+      </w:pPr>
+      <w:r>
+        <w:rPr>
+          <w:rtl w:val="0"/>
+        </w:rPr>
+        <w:t xml:space="preserve">Some are not (.e.g travel from one panel to another)</w:t>
+      </w:r>
+    </w:p>
+    <w:p>
+      <w:pPr>
+        <w:numPr>
+          <w:ilvl w:val="1"/>
+          <w:numId w:val="2"/>
+        </w:numPr>
+        <w:ind w:left="1440" w:hanging="360"/>
+        <w:rPr>
+          <w:u w:val="none"/>
+        </w:rPr>
+      </w:pPr>
+      <w:r>
+        <w:rPr>
+          <w:rtl w:val="0"/>
+        </w:rPr>
+        <w:t xml:space="preserve">Fact_print_ordered specific:</w:t>
+      </w:r>
+    </w:p>
+    <w:p>
+      <w:pPr>
+        <w:numPr>
+          <w:ilvl w:val="2"/>
+          <w:numId w:val="2"/>
+        </w:numPr>
+        <w:ind w:left="2160" w:hanging="360"/>
+        <w:rPr>
+          <w:u w:val="none"/>
+        </w:rPr>
+      </w:pPr>
+      <w:r>
+        <w:rPr>
+          <w:rtl w:val="0"/>
+        </w:rPr>
+        <w:t xml:space="preserve">Revenue allocation rules are expected to be explored and agreed upon during the data model design phase</w:t>
+      </w:r>
+    </w:p>
+    <w:p>
+      <w:pPr>
+        <w:numPr>
+          <w:ilvl w:val="1"/>
+          <w:numId w:val="2"/>
+        </w:numPr>
+        <w:ind w:left="1440" w:hanging="360"/>
+        <w:rPr>
+          <w:u w:val="none"/>
+        </w:rPr>
+      </w:pPr>
+      <w:r>
+        <w:rPr>
+          <w:rtl w:val="0"/>
+        </w:rPr>
+        <w:t xml:space="preserve">What type of assistance are you looking for? Full ownership?</w:t>
+      </w:r>
+    </w:p>
+    <w:p>
+      <w:pPr>
+        <w:numPr>
+          <w:ilvl w:val="2"/>
+          <w:numId w:val="2"/>
+        </w:numPr>
+        <w:ind w:left="2160" w:hanging="360"/>
         <w:rPr/>
       </w:pPr>
       <w:r>
         <w:rPr>
           <w:rtl w:val="0"/>
         </w:rPr>
-        <w:t xml:space="preserve">Are there any governance policies to be implemented?</w:t>
-      </w:r>
-    </w:p>
-    <w:p>
-      <w:pPr>
-        <w:numPr>
-          <w:ilvl w:val="1"/>
-          <w:numId w:val="2"/>
-        </w:numPr>
-        <w:ind w:left="1440" w:hanging="360"/>
-      </w:pPr>
-      <w:r>
-        <w:rPr>
-          <w:rtl w:val="0"/>
-        </w:rPr>
-        <w:t xml:space="preserve">Are there existing metric definitions documented, or do they need to be created from scratch for the semantic layer?</w:t>
-      </w:r>
-      <w:r>
-        <w:rPr>
-          <w:rtl w:val="0"/>
-        </w:rPr>
-      </w:r>
-    </w:p>
-    <w:p>
-      <w:pPr>
-        <w:numPr>
-          <w:ilvl w:val="1"/>
-          <w:numId w:val="2"/>
-        </w:numPr>
-        <w:ind w:left="1440" w:hanging="360"/>
-        <w:rPr>
-          <w:u w:val="none"/>
-        </w:rPr>
-      </w:pPr>
-      <w:r>
-        <w:rPr>
-          <w:rtl w:val="0"/>
-        </w:rPr>
-        <w:t xml:space="preserve">Do we have a clear view of what needs to be made available in the semantic layer?</w:t>
-      </w:r>
-    </w:p>
-    <w:p>
-      <w:pPr>
-        <w:numPr>
-          <w:ilvl w:val="1"/>
-          <w:numId w:val="2"/>
-        </w:numPr>
-        <w:ind w:left="1440" w:hanging="360"/>
-        <w:rPr>
-          <w:u w:val="none"/>
-        </w:rPr>
-      </w:pPr>
-      <w:r>
-        <w:rPr>
-          <w:rtl w:val="0"/>
-        </w:rPr>
-        <w:t xml:space="preserve">What type of assistance are you looking for? Full ownership?</w:t>
+        <w:t xml:space="preserve">Designing the solution high level (solution architecture)</w:t>
       </w:r>
     </w:p>
     <w:p>
@@ -2062,7 +2782,7 @@
         <w:rPr>
           <w:rtl w:val="0"/>
         </w:rPr>
-        <w:t xml:space="preserve">End to end solution</w:t>
+        <w:t xml:space="preserve">Designing the new DBT projects and data models (data architecture)</w:t>
       </w:r>
     </w:p>
     <w:p>
@@ -2078,7 +2798,7 @@
         <w:rPr>
           <w:rtl w:val="0"/>
         </w:rPr>
-        <w:t xml:space="preserve">Designing the solution high level (soluition architecture)</w:t>
+        <w:t xml:space="preserve">Getting approvals</w:t>
       </w:r>
     </w:p>
     <w:p>
@@ -2094,7 +2814,7 @@
         <w:rPr>
           <w:rtl w:val="0"/>
         </w:rPr>
-        <w:t xml:space="preserve">Designing the new DBT projects and data models (data architecture)</w:t>
+        <w:t xml:space="preserve">Includes hands on</w:t>
       </w:r>
     </w:p>
     <w:p>
@@ -2110,7 +2830,7 @@
         <w:rPr>
           <w:rtl w:val="0"/>
         </w:rPr>
-        <w:t xml:space="preserve">Getting approvals</w:t>
+        <w:t xml:space="preserve">Includes testing</w:t>
       </w:r>
     </w:p>
     <w:p>
@@ -2126,56 +2846,7 @@
         <w:rPr>
           <w:rtl w:val="0"/>
         </w:rPr>
-        <w:t xml:space="preserve">Includes hands on</w:t>
-      </w:r>
-    </w:p>
-    <w:p>
-      <w:pPr>
-        <w:numPr>
-          <w:ilvl w:val="2"/>
-          <w:numId w:val="2"/>
-        </w:numPr>
-        <w:ind w:left="2160" w:hanging="360"/>
-        <w:rPr/>
-      </w:pPr>
-      <w:r>
-        <w:rPr>
-          <w:rtl w:val="0"/>
-        </w:rPr>
-        <w:t xml:space="preserve">Includes testing</w:t>
-      </w:r>
-    </w:p>
-    <w:p>
-      <w:pPr>
-        <w:numPr>
-          <w:ilvl w:val="2"/>
-          <w:numId w:val="2"/>
-        </w:numPr>
-        <w:ind w:left="2160" w:hanging="360"/>
-        <w:rPr/>
-      </w:pPr>
-      <w:r>
-        <w:rPr>
-          <w:rtl w:val="0"/>
-        </w:rPr>
-        <w:t xml:space="preserve">What about productionization</w:t>
-      </w:r>
-    </w:p>
-    <w:p>
-      <w:pPr>
-        <w:numPr>
-          <w:ilvl w:val="1"/>
-          <w:numId w:val="2"/>
-        </w:numPr>
-        <w:ind w:left="1440" w:hanging="360"/>
-        <w:rPr>
-          <w:u w:val="none"/>
-        </w:rPr>
-      </w:pPr>
-      <w:r>
-        <w:rPr>
-          <w:rtl w:val="0"/>
-        </w:rPr>
+        <w:t xml:space="preserve">No productionization</w:t>
       </w:r>
     </w:p>
     <w:p>
@@ -2214,6 +2885,54 @@
     <w:p>
       <w:pPr>
         <w:numPr>
+          <w:ilvl w:val="2"/>
+          <w:numId w:val="2"/>
+        </w:numPr>
+        <w:ind w:left="2160" w:hanging="360"/>
+      </w:pPr>
+      <w:r>
+        <w:rPr>
+          <w:rtl w:val="0"/>
+        </w:rPr>
+        <w:t xml:space="preserve">Answered above</w:t>
+      </w:r>
+    </w:p>
+    <w:p>
+      <w:pPr>
+        <w:numPr>
+          <w:ilvl w:val="1"/>
+          <w:numId w:val="2"/>
+        </w:numPr>
+        <w:ind w:left="1440" w:hanging="360"/>
+        <w:rPr>
+          <w:u w:val="none"/>
+        </w:rPr>
+      </w:pPr>
+      <w:r>
+        <w:rPr>
+          <w:rtl w:val="0"/>
+        </w:rPr>
+        <w:t xml:space="preserve">Is the scope expected to migrate the logic from the current state as is, or enhance it to cover for more business transformations? E.g. transformations that facilitate usability for inheritors?</w:t>
+      </w:r>
+    </w:p>
+    <w:p>
+      <w:pPr>
+        <w:numPr>
+          <w:ilvl w:val="2"/>
+          <w:numId w:val="2"/>
+        </w:numPr>
+        <w:ind w:left="2160" w:hanging="360"/>
+      </w:pPr>
+      <w:r>
+        <w:rPr>
+          <w:rtl w:val="0"/>
+        </w:rPr>
+        <w:t xml:space="preserve">Answered above</w:t>
+      </w:r>
+    </w:p>
+    <w:p>
+      <w:pPr>
+        <w:numPr>
           <w:ilvl w:val="1"/>
           <w:numId w:val="2"/>
         </w:numPr>
@@ -2228,6 +2947,24 @@
         </w:rPr>
         <w:t xml:space="preserve">Do you have the list of models / mapping between models and tables?</w:t>
       </w:r>
+    </w:p>
+    <w:p>
+      <w:pPr>
+        <w:numPr>
+          <w:ilvl w:val="2"/>
+          <w:numId w:val="2"/>
+        </w:numPr>
+        <w:ind w:left="2160" w:hanging="360"/>
+        <w:rPr>
+          <w:u w:val="none"/>
+        </w:rPr>
+      </w:pPr>
+      <w:r>
+        <w:rPr>
+          <w:rtl w:val="0"/>
+        </w:rPr>
+        <w:t xml:space="preserve">no</w:t>
+      </w:r>
       <w:r>
         <w:rPr>
           <w:rtl w:val="0"/>
@@ -2252,6 +2989,78 @@
     <w:p>
       <w:pPr>
         <w:numPr>
+          <w:ilvl w:val="2"/>
+          <w:numId w:val="2"/>
+        </w:numPr>
+        <w:ind w:left="2160" w:hanging="360"/>
+        <w:rPr>
+          <w:u w:val="none"/>
+        </w:rPr>
+      </w:pPr>
+      <w:r>
+        <w:rPr>
+          <w:rtl w:val="0"/>
+        </w:rPr>
+        <w:t xml:space="preserve">80% medium</w:t>
+      </w:r>
+    </w:p>
+    <w:p>
+      <w:pPr>
+        <w:numPr>
+          <w:ilvl w:val="2"/>
+          <w:numId w:val="2"/>
+        </w:numPr>
+        <w:ind w:left="2160" w:hanging="360"/>
+        <w:rPr>
+          <w:u w:val="none"/>
+        </w:rPr>
+      </w:pPr>
+      <w:r>
+        <w:rPr>
+          <w:rtl w:val="0"/>
+        </w:rPr>
+        <w:t xml:space="preserve">20% complex</w:t>
+      </w:r>
+    </w:p>
+    <w:p>
+      <w:pPr>
+        <w:numPr>
+          <w:ilvl w:val="2"/>
+          <w:numId w:val="2"/>
+        </w:numPr>
+        <w:ind w:left="2160" w:hanging="360"/>
+        <w:rPr>
+          <w:u w:val="none"/>
+        </w:rPr>
+      </w:pPr>
+      <w:r>
+        <w:rPr>
+          <w:rtl w:val="0"/>
+        </w:rPr>
+        <w:t xml:space="preserve">Problem is intermediary tables might be used by other domains</w:t>
+      </w:r>
+    </w:p>
+    <w:p>
+      <w:pPr>
+        <w:numPr>
+          <w:ilvl w:val="2"/>
+          <w:numId w:val="2"/>
+        </w:numPr>
+        <w:ind w:left="2160" w:hanging="360"/>
+        <w:rPr>
+          <w:u w:val="none"/>
+        </w:rPr>
+      </w:pPr>
+      <w:r>
+        <w:rPr>
+          <w:rtl w:val="0"/>
+        </w:rPr>
+        <w:t xml:space="preserve">Kevin will communicate with other domains to let them know</w:t>
+      </w:r>
+    </w:p>
+    <w:p>
+      <w:pPr>
+        <w:numPr>
           <w:ilvl w:val="1"/>
           <w:numId w:val="2"/>
         </w:numPr>
@@ -2270,6 +3079,24 @@
     <w:p>
       <w:pPr>
         <w:numPr>
+          <w:ilvl w:val="2"/>
+          <w:numId w:val="2"/>
+        </w:numPr>
+        <w:ind w:left="2160" w:hanging="360"/>
+        <w:rPr>
+          <w:u w:val="none"/>
+        </w:rPr>
+      </w:pPr>
+      <w:r>
+        <w:rPr>
+          <w:rtl w:val="0"/>
+        </w:rPr>
+        <w:t xml:space="preserve">yes</w:t>
+      </w:r>
+    </w:p>
+    <w:p>
+      <w:pPr>
+        <w:numPr>
           <w:ilvl w:val="1"/>
           <w:numId w:val="2"/>
         </w:numPr>
@@ -2281,6 +3108,21 @@
         </w:rPr>
         <w:t xml:space="preserve">What is the current refresh frequency for each pipeline (daily, hourly, near-real-time)?</w:t>
       </w:r>
+    </w:p>
+    <w:p>
+      <w:pPr>
+        <w:numPr>
+          <w:ilvl w:val="2"/>
+          <w:numId w:val="2"/>
+        </w:numPr>
+        <w:ind w:left="2160" w:hanging="360"/>
+      </w:pPr>
+      <w:r>
+        <w:rPr>
+          <w:rtl w:val="0"/>
+        </w:rPr>
+        <w:t xml:space="preserve">Answered above</w:t>
+      </w:r>
       <w:r>
         <w:rPr>
           <w:rtl w:val="0"/>
@@ -2301,25 +3143,23 @@
         </w:rPr>
         <w:t xml:space="preserve">Are there any existing data quality tests or validation rules that need to be migrated? </w:t>
       </w:r>
-      <w:r>
-        <w:rPr>
-          <w:rtl w:val="0"/>
-        </w:rPr>
-      </w:r>
-    </w:p>
-    <w:p>
-      <w:pPr>
-        <w:numPr>
-          <w:ilvl w:val="1"/>
-          <w:numId w:val="2"/>
-        </w:numPr>
-        <w:ind w:left="1440" w:hanging="360"/>
-      </w:pPr>
-      <w:r>
-        <w:rPr>
-          <w:rtl w:val="0"/>
-        </w:rPr>
-        <w:t xml:space="preserve">What compliance/audit requirements apply to financial reporting tables (Merchant Fee, Payout)?</w:t>
+    </w:p>
+    <w:p>
+      <w:pPr>
+        <w:numPr>
+          <w:ilvl w:val="2"/>
+          <w:numId w:val="2"/>
+        </w:numPr>
+        <w:ind w:left="2160" w:hanging="360"/>
+        <w:rPr>
+          <w:u w:val="none"/>
+        </w:rPr>
+      </w:pPr>
+      <w:r>
+        <w:rPr>
+          <w:rtl w:val="0"/>
+        </w:rPr>
+        <w:t xml:space="preserve">no</w:t>
       </w:r>
     </w:p>
     <w:p>
@@ -2351,40 +3191,46 @@
         </w:rPr>
         <w:t xml:space="preserve">Is there a parallel-run period expected where both old and new pipelines coexist? </w:t>
       </w:r>
-      <w:r>
-        <w:rPr>
-          <w:rtl w:val="0"/>
-        </w:rPr>
-      </w:r>
-    </w:p>
-    <w:p>
-      <w:pPr>
-        <w:numPr>
-          <w:ilvl w:val="1"/>
-          <w:numId w:val="2"/>
-        </w:numPr>
-        <w:ind w:left="1440" w:hanging="360"/>
-      </w:pPr>
-      <w:r>
-        <w:rPr>
-          <w:rtl w:val="0"/>
-        </w:rPr>
-        <w:t xml:space="preserve">Who are the primary downstream consumers, and what is the communication plan for migration? </w:t>
-      </w:r>
-    </w:p>
-    <w:p>
-      <w:pPr>
-        <w:numPr>
-          <w:ilvl w:val="1"/>
-          <w:numId w:val="2"/>
-        </w:numPr>
-        <w:ind w:left="1440" w:hanging="360"/>
-      </w:pPr>
-      <w:r>
-        <w:rPr>
-          <w:rtl w:val="0"/>
-        </w:rPr>
-        <w:t xml:space="preserve">What is the acceptable downtime or data latency during migration?</w:t>
+    </w:p>
+    <w:p>
+      <w:pPr>
+        <w:numPr>
+          <w:ilvl w:val="2"/>
+          <w:numId w:val="2"/>
+        </w:numPr>
+        <w:ind w:left="2160" w:hanging="360"/>
+        <w:rPr>
+          <w:u w:val="none"/>
+        </w:rPr>
+      </w:pPr>
+      <w:r>
+        <w:rPr>
+          <w:rtl w:val="0"/>
+        </w:rPr>
+        <w:t xml:space="preserve">Parallel run is needed</w:t>
+      </w:r>
+    </w:p>
+    <w:p>
+      <w:pPr>
+        <w:numPr>
+          <w:ilvl w:val="2"/>
+          <w:numId w:val="2"/>
+        </w:numPr>
+        <w:ind w:left="2160" w:hanging="360"/>
+        <w:rPr>
+          <w:u w:val="none"/>
+        </w:rPr>
+      </w:pPr>
+      <w:r>
+        <w:rPr>
+          <w:rtl w:val="0"/>
+        </w:rPr>
+        <w:t xml:space="preserve">Not yet defined</w:t>
+      </w:r>
+      <w:r>
+        <w:rPr>
+          <w:rtl w:val="0"/>
+        </w:rPr>
       </w:r>
     </w:p>
     <w:p>
@@ -2437,6 +3283,21 @@
     <w:p>
       <w:pPr>
         <w:numPr>
+          <w:ilvl w:val="2"/>
+          <w:numId w:val="2"/>
+        </w:numPr>
+        <w:ind w:left="2160" w:hanging="360"/>
+      </w:pPr>
+      <w:r>
+        <w:rPr>
+          <w:rtl w:val="0"/>
+        </w:rPr>
+        <w:t xml:space="preserve">Answered above</w:t>
+      </w:r>
+    </w:p>
+    <w:p>
+      <w:pPr>
+        <w:numPr>
           <w:ilvl w:val="1"/>
           <w:numId w:val="2"/>
         </w:numPr>
@@ -2452,6 +3313,24 @@
     <w:p>
       <w:pPr>
         <w:numPr>
+          <w:ilvl w:val="2"/>
+          <w:numId w:val="2"/>
+        </w:numPr>
+        <w:ind w:left="2160" w:hanging="360"/>
+        <w:rPr>
+          <w:u w:val="none"/>
+        </w:rPr>
+      </w:pPr>
+      <w:r>
+        <w:rPr>
+          <w:rtl w:val="0"/>
+        </w:rPr>
+        <w:t xml:space="preserve">Yes, redesign all the way into the standard</w:t>
+      </w:r>
+    </w:p>
+    <w:p>
+      <w:pPr>
+        <w:numPr>
           <w:ilvl w:val="1"/>
           <w:numId w:val="2"/>
         </w:numPr>
@@ -2462,6 +3341,21 @@
           <w:rtl w:val="0"/>
         </w:rPr>
         <w:t xml:space="preserve">Is there existing documentation on the Transform project models, or will reverse engineering be required?</w:t>
+      </w:r>
+    </w:p>
+    <w:p>
+      <w:pPr>
+        <w:numPr>
+          <w:ilvl w:val="2"/>
+          <w:numId w:val="2"/>
+        </w:numPr>
+        <w:ind w:left="2160" w:hanging="360"/>
+      </w:pPr>
+      <w:r>
+        <w:rPr>
+          <w:rtl w:val="0"/>
+        </w:rPr>
+        <w:t xml:space="preserve">No existing documentation</w:t>
       </w:r>
     </w:p>
     <w:p>

</xml_diff>